<commit_message>
De-brand: present as an independent personal project
- Remove the Capital Group logo from all games (header now shows only the
  'THE LONG GAME' wordmark) and drop the 'internal use only' footer.
- Genericize the Sales edition: 'American Balanced Fund'/ABALX → a generic
  'Balanced Fund', remove the ticker and the external advisor call-to-action.
- Replace 'The Capital System' framing with a neutral long-term-investing line;
  genericize all disclaimers.
- De-brand the consultant deck + FAQ (title, footers, and the logo baked into
  the embedded screenshots) and regenerate their PDFs.
- De-brand the archived prototypes and the docs; add a personal-project note to
  the README; remove the internal compliance checklist and branded binary guides.
- Regenerate README screenshots against the de-branded games.

Co-Authored-By: Claude Opus 4.8 <noreply@anthropic.com>
Claude-Session: https://claude.ai/code/session_01EfdgwHTKZvsSK3ggYc4z9J
</commit_message>
<xml_diff>
--- a/consultant-materials/The-Long-Game-Live-Consultant-FAQ.docx
+++ b/consultant-materials/The-Long-Game-Live-Consultant-FAQ.docx
@@ -42,7 +42,7 @@
                 <w:spacing w:val="40"/>
                 <w:sz w:val="20"/>
               </w:rPr>
-              <w:t>CAPITAL GROUP  ·  THE LONG GAME</w:t>
+              <w:t>THE LONG GAME</w:t>
             </w:r>
             <w:r>
               <w:rPr/>
@@ -335,7 +335,7 @@
       </w:r>
       <w:r>
         <w:rPr/>
-        <w:t>. A separate Sales edition adds the American Balanced Fund for solo, advisor-led use.</w:t>
+        <w:t>. A separate Sales edition adds a representative balanced fund for solo, advisor-led use.</w:t>
       </w:r>
     </w:p>
     <w:p>
@@ -650,7 +650,7 @@
       </w:pPr>
       <w:r>
         <w:rPr/>
-        <w:t>The Long Game · Live Room · Consultant FAQ · July 2026 · For internal use only — do not disseminate.</w:t>
+        <w:t>The Long Game · Live Room · Consultant FAQ · July 2026.</w:t>
       </w:r>
     </w:p>
     <w:sectPr>

</xml_diff>